<commit_message>
Added latest playbooks zip and webhook mapping changes
</commit_message>
<xml_diff>
--- a/docs/GreyNoise - Google SecOps SOAR Integration - User Guide.docx
+++ b/docs/GreyNoise - Google SecOps SOAR Integration - User Guide.docx
@@ -21,12 +21,12 @@
           <wp:inline distB="114300" distT="114300" distL="114300" distR="114300">
             <wp:extent cx="939800" cy="901700"/>
             <wp:effectExtent b="0" l="0" r="0" t="0"/>
-            <wp:docPr id="20" name="image22.png"/>
+            <wp:docPr id="20" name="image9.png"/>
             <a:graphic>
               <a:graphicData uri="http://schemas.openxmlformats.org/drawingml/2006/picture">
                 <pic:pic>
                   <pic:nvPicPr>
-                    <pic:cNvPr id="0" name="image22.png"/>
+                    <pic:cNvPr id="0" name="image9.png"/>
                     <pic:cNvPicPr preferRelativeResize="0"/>
                   </pic:nvPicPr>
                   <pic:blipFill>
@@ -347,7 +347,7 @@
     </w:p>
     <w:sdt>
       <w:sdtPr>
-        <w:id w:val="1899130831"/>
+        <w:id w:val="-535452135"/>
         <w:docPartObj>
           <w:docPartGallery w:val="Table of Contents"/>
           <w:docPartUnique w:val="1"/>
@@ -2382,7 +2382,7 @@
               <w:vertAlign w:val="baseline"/>
             </w:rPr>
           </w:pPr>
-          <w:hyperlink w:anchor="_x4qr0ilx77in">
+          <w:hyperlink w:anchor="_nhtaij6jfaeu">
             <w:r>
               <w:rPr>
                 <w:rFonts w:ascii="Open Sans" w:cs="Open Sans" w:eastAsia="Open Sans" w:hAnsi="Open Sans"/>
@@ -2400,171 +2400,9 @@
                 <w:vertAlign w:val="baseline"/>
                 <w:rtl w:val="0"/>
               </w:rPr>
-              <w:t xml:space="preserve">Ontology Mapping</w:t>
+              <w:t xml:space="preserve">Limitations</w:t>
               <w:tab/>
               <w:t xml:space="preserve">35</w:t>
-            </w:r>
-          </w:hyperlink>
-          <w:r>
-            <w:rPr>
-              <w:rtl w:val="0"/>
-            </w:rPr>
-          </w:r>
-        </w:p>
-        <w:p>
-          <w:pPr>
-            <w:widowControl w:val="0"/>
-            <w:shd w:fill="auto" w:val="clear"/>
-            <w:tabs>
-              <w:tab w:val="right" w:leader="none" w:pos="12000"/>
-            </w:tabs>
-            <w:spacing w:after="0" w:before="60" w:lineRule="auto"/>
-            <w:ind w:left="720" w:firstLine="0"/>
-            <w:rPr>
-              <w:rFonts w:ascii="Arial" w:cs="Arial" w:eastAsia="Arial" w:hAnsi="Arial"/>
-              <w:b w:val="0"/>
-              <w:bCs w:val="0"/>
-              <w:i w:val="0"/>
-              <w:iCs w:val="0"/>
-              <w:smallCaps w:val="0"/>
-              <w:strike w:val="0"/>
-              <w:color w:val="000000"/>
-              <w:sz w:val="22"/>
-              <w:szCs w:val="22"/>
-              <w:u w:val="none"/>
-              <w:shd w:fill="auto" w:val="clear"/>
-              <w:vertAlign w:val="baseline"/>
-            </w:rPr>
-          </w:pPr>
-          <w:hyperlink w:anchor="_v0dowxx4kjex">
-            <w:r>
-              <w:rPr>
-                <w:rFonts w:ascii="Arial" w:cs="Arial" w:eastAsia="Arial" w:hAnsi="Arial"/>
-                <w:b w:val="0"/>
-                <w:bCs w:val="0"/>
-                <w:i w:val="0"/>
-                <w:iCs w:val="0"/>
-                <w:smallCaps w:val="0"/>
-                <w:strike w:val="0"/>
-                <w:color w:val="000000"/>
-                <w:sz w:val="22"/>
-                <w:szCs w:val="22"/>
-                <w:u w:val="none"/>
-                <w:shd w:fill="auto" w:val="clear"/>
-                <w:vertAlign w:val="baseline"/>
-                <w:rtl w:val="0"/>
-              </w:rPr>
-              <w:t xml:space="preserve">Import Ontology Manually</w:t>
-              <w:tab/>
-              <w:t xml:space="preserve">35</w:t>
-            </w:r>
-          </w:hyperlink>
-          <w:r>
-            <w:rPr>
-              <w:rtl w:val="0"/>
-            </w:rPr>
-          </w:r>
-        </w:p>
-        <w:p>
-          <w:pPr>
-            <w:widowControl w:val="0"/>
-            <w:shd w:fill="auto" w:val="clear"/>
-            <w:tabs>
-              <w:tab w:val="right" w:leader="none" w:pos="12000"/>
-            </w:tabs>
-            <w:spacing w:after="0" w:before="60" w:lineRule="auto"/>
-            <w:ind w:left="720" w:firstLine="0"/>
-            <w:rPr>
-              <w:rFonts w:ascii="Arial" w:cs="Arial" w:eastAsia="Arial" w:hAnsi="Arial"/>
-              <w:b w:val="0"/>
-              <w:bCs w:val="0"/>
-              <w:i w:val="0"/>
-              <w:iCs w:val="0"/>
-              <w:smallCaps w:val="0"/>
-              <w:strike w:val="0"/>
-              <w:color w:val="000000"/>
-              <w:sz w:val="22"/>
-              <w:szCs w:val="22"/>
-              <w:u w:val="none"/>
-              <w:shd w:fill="auto" w:val="clear"/>
-              <w:vertAlign w:val="baseline"/>
-            </w:rPr>
-          </w:pPr>
-          <w:hyperlink w:anchor="_u7b48s4x8vnn">
-            <w:r>
-              <w:rPr>
-                <w:rFonts w:ascii="Open Sans" w:cs="Open Sans" w:eastAsia="Open Sans" w:hAnsi="Open Sans"/>
-                <w:b w:val="0"/>
-                <w:bCs w:val="0"/>
-                <w:i w:val="0"/>
-                <w:iCs w:val="0"/>
-                <w:smallCaps w:val="0"/>
-                <w:strike w:val="0"/>
-                <w:color w:val="000000"/>
-                <w:sz w:val="22"/>
-                <w:szCs w:val="22"/>
-                <w:u w:val="none"/>
-                <w:shd w:fill="auto" w:val="clear"/>
-                <w:vertAlign w:val="baseline"/>
-                <w:rtl w:val="0"/>
-              </w:rPr>
-              <w:t xml:space="preserve">Ontology Mapping Table</w:t>
-              <w:tab/>
-              <w:t xml:space="preserve">35</w:t>
-            </w:r>
-          </w:hyperlink>
-          <w:r>
-            <w:rPr>
-              <w:rtl w:val="0"/>
-            </w:rPr>
-          </w:r>
-        </w:p>
-        <w:p>
-          <w:pPr>
-            <w:widowControl w:val="0"/>
-            <w:shd w:fill="auto" w:val="clear"/>
-            <w:tabs>
-              <w:tab w:val="right" w:leader="none" w:pos="12000"/>
-            </w:tabs>
-            <w:spacing w:after="0" w:before="60" w:lineRule="auto"/>
-            <w:ind w:left="0" w:firstLine="0"/>
-            <w:rPr>
-              <w:rFonts w:ascii="Arial" w:cs="Arial" w:eastAsia="Arial" w:hAnsi="Arial"/>
-              <w:b w:val="1"/>
-              <w:bCs w:val="1"/>
-              <w:i w:val="0"/>
-              <w:iCs w:val="0"/>
-              <w:smallCaps w:val="0"/>
-              <w:strike w:val="0"/>
-              <w:color w:val="000000"/>
-              <w:sz w:val="22"/>
-              <w:szCs w:val="22"/>
-              <w:u w:val="none"/>
-              <w:shd w:fill="auto" w:val="clear"/>
-              <w:vertAlign w:val="baseline"/>
-            </w:rPr>
-          </w:pPr>
-          <w:hyperlink w:anchor="_nhtaij6jfaeu">
-            <w:r>
-              <w:rPr>
-                <w:rFonts w:ascii="Open Sans" w:cs="Open Sans" w:eastAsia="Open Sans" w:hAnsi="Open Sans"/>
-                <w:b w:val="1"/>
-                <w:bCs w:val="1"/>
-                <w:i w:val="0"/>
-                <w:iCs w:val="0"/>
-                <w:smallCaps w:val="0"/>
-                <w:strike w:val="0"/>
-                <w:color w:val="000000"/>
-                <w:sz w:val="22"/>
-                <w:szCs w:val="22"/>
-                <w:u w:val="none"/>
-                <w:shd w:fill="auto" w:val="clear"/>
-                <w:vertAlign w:val="baseline"/>
-                <w:rtl w:val="0"/>
-              </w:rPr>
-              <w:t xml:space="preserve">Limitations</w:t>
-              <w:tab/>
-              <w:t xml:space="preserve">36</w:t>
             </w:r>
           </w:hyperlink>
           <w:r>
@@ -2618,7 +2456,7 @@
               </w:rPr>
               <w:t xml:space="preserve">Known Behaviors</w:t>
               <w:tab/>
-              <w:t xml:space="preserve">37</w:t>
+              <w:t xml:space="preserve">36</w:t>
             </w:r>
           </w:hyperlink>
           <w:r>
@@ -2672,7 +2510,7 @@
               </w:rPr>
               <w:t xml:space="preserve">Troubleshooting</w:t>
               <w:tab/>
-              <w:t xml:space="preserve">38</w:t>
+              <w:t xml:space="preserve">37</w:t>
             </w:r>
           </w:hyperlink>
           <w:r>
@@ -2726,7 +2564,7 @@
               </w:rPr>
               <w:t xml:space="preserve">Case 1: PythonProcess Has timed out.</w:t>
               <w:tab/>
-              <w:t xml:space="preserve">38</w:t>
+              <w:t xml:space="preserve">37</w:t>
             </w:r>
           </w:hyperlink>
           <w:r>
@@ -2780,7 +2618,7 @@
               </w:rPr>
               <w:t xml:space="preserve">Case 2: Unknown error running Action.</w:t>
               <w:tab/>
-              <w:t xml:space="preserve">40</w:t>
+              <w:t xml:space="preserve">39</w:t>
             </w:r>
           </w:hyperlink>
           <w:r>
@@ -3085,7 +2923,7 @@
       <w:pPr>
         <w:numPr>
           <w:ilvl w:val="0"/>
-          <w:numId w:val="22"/>
+          <w:numId w:val="21"/>
         </w:numPr>
         <w:spacing w:after="0" w:afterAutospacing="0"/>
         <w:rPr/>
@@ -3116,7 +2954,7 @@
       <w:pPr>
         <w:numPr>
           <w:ilvl w:val="0"/>
-          <w:numId w:val="22"/>
+          <w:numId w:val="21"/>
         </w:numPr>
         <w:spacing w:after="0" w:afterAutospacing="0"/>
         <w:rPr/>
@@ -3147,7 +2985,7 @@
       <w:pPr>
         <w:numPr>
           <w:ilvl w:val="1"/>
-          <w:numId w:val="22"/>
+          <w:numId w:val="21"/>
         </w:numPr>
         <w:spacing w:after="0" w:afterAutospacing="0"/>
         <w:ind w:left="1440" w:hanging="360"/>
@@ -3166,7 +3004,7 @@
       <w:pPr>
         <w:numPr>
           <w:ilvl w:val="1"/>
-          <w:numId w:val="22"/>
+          <w:numId w:val="21"/>
         </w:numPr>
         <w:spacing w:after="0" w:afterAutospacing="0"/>
         <w:ind w:left="1440" w:hanging="360"/>
@@ -3185,7 +3023,7 @@
       <w:pPr>
         <w:numPr>
           <w:ilvl w:val="0"/>
-          <w:numId w:val="22"/>
+          <w:numId w:val="21"/>
         </w:numPr>
         <w:spacing w:after="0" w:afterAutospacing="0"/>
         <w:rPr/>
@@ -3216,7 +3054,7 @@
       <w:pPr>
         <w:numPr>
           <w:ilvl w:val="1"/>
-          <w:numId w:val="22"/>
+          <w:numId w:val="21"/>
         </w:numPr>
         <w:spacing w:after="0" w:afterAutospacing="0"/>
         <w:ind w:left="1440" w:hanging="360"/>
@@ -3235,7 +3073,7 @@
       <w:pPr>
         <w:numPr>
           <w:ilvl w:val="1"/>
-          <w:numId w:val="22"/>
+          <w:numId w:val="21"/>
         </w:numPr>
         <w:spacing w:after="0" w:afterAutospacing="0"/>
         <w:ind w:left="1440" w:hanging="360"/>
@@ -3254,7 +3092,7 @@
       <w:pPr>
         <w:numPr>
           <w:ilvl w:val="1"/>
-          <w:numId w:val="22"/>
+          <w:numId w:val="21"/>
         </w:numPr>
         <w:spacing w:after="0" w:afterAutospacing="0"/>
         <w:ind w:left="1440" w:hanging="360"/>
@@ -3273,7 +3111,7 @@
       <w:pPr>
         <w:numPr>
           <w:ilvl w:val="0"/>
-          <w:numId w:val="22"/>
+          <w:numId w:val="21"/>
         </w:numPr>
         <w:spacing w:after="0" w:afterAutospacing="0"/>
         <w:rPr/>
@@ -3291,7 +3129,7 @@
       <w:pPr>
         <w:numPr>
           <w:ilvl w:val="1"/>
-          <w:numId w:val="22"/>
+          <w:numId w:val="21"/>
         </w:numPr>
         <w:spacing w:after="0" w:afterAutospacing="0"/>
         <w:ind w:left="1440" w:hanging="360"/>
@@ -3329,7 +3167,7 @@
       <w:pPr>
         <w:numPr>
           <w:ilvl w:val="1"/>
-          <w:numId w:val="22"/>
+          <w:numId w:val="21"/>
         </w:numPr>
         <w:spacing w:after="0" w:afterAutospacing="0"/>
         <w:ind w:left="1440" w:hanging="360"/>
@@ -3367,7 +3205,7 @@
       <w:pPr>
         <w:numPr>
           <w:ilvl w:val="1"/>
-          <w:numId w:val="22"/>
+          <w:numId w:val="21"/>
         </w:numPr>
         <w:spacing w:after="0" w:lineRule="auto"/>
         <w:ind w:left="1440" w:hanging="360"/>
@@ -3803,12 +3641,12 @@
           <wp:inline distB="114300" distT="114300" distL="114300" distR="114300">
             <wp:extent cx="5943600" cy="1752600"/>
             <wp:effectExtent b="0" l="0" r="0" t="0"/>
-            <wp:docPr id="10" name="image17.png"/>
+            <wp:docPr id="10" name="image7.png"/>
             <a:graphic>
               <a:graphicData uri="http://schemas.openxmlformats.org/drawingml/2006/picture">
                 <pic:pic>
                   <pic:nvPicPr>
-                    <pic:cNvPr id="0" name="image17.png"/>
+                    <pic:cNvPr id="0" name="image7.png"/>
                     <pic:cNvPicPr preferRelativeResize="0"/>
                   </pic:nvPicPr>
                   <pic:blipFill>
@@ -3894,12 +3732,12 @@
           <wp:inline distB="114300" distT="114300" distL="114300" distR="114300">
             <wp:extent cx="5943600" cy="2603500"/>
             <wp:effectExtent b="0" l="0" r="0" t="0"/>
-            <wp:docPr id="22" name="image14.png"/>
+            <wp:docPr id="22" name="image16.png"/>
             <a:graphic>
               <a:graphicData uri="http://schemas.openxmlformats.org/drawingml/2006/picture">
                 <pic:pic>
                   <pic:nvPicPr>
-                    <pic:cNvPr id="0" name="image14.png"/>
+                    <pic:cNvPr id="0" name="image16.png"/>
                     <pic:cNvPicPr preferRelativeResize="0"/>
                   </pic:nvPicPr>
                   <pic:blipFill>
@@ -4211,12 +4049,12 @@
           <wp:inline distB="114300" distT="114300" distL="114300" distR="114300">
             <wp:extent cx="3008305" cy="4662488"/>
             <wp:effectExtent b="0" l="0" r="0" t="0"/>
-            <wp:docPr id="27" name="image16.png"/>
+            <wp:docPr id="27" name="image19.png"/>
             <a:graphic>
               <a:graphicData uri="http://schemas.openxmlformats.org/drawingml/2006/picture">
                 <pic:pic>
                   <pic:nvPicPr>
-                    <pic:cNvPr id="0" name="image16.png"/>
+                    <pic:cNvPr id="0" name="image19.png"/>
                     <pic:cNvPicPr preferRelativeResize="0"/>
                   </pic:nvPicPr>
                   <pic:blipFill>
@@ -4350,12 +4188,12 @@
           <wp:inline distB="114300" distT="114300" distL="114300" distR="114300">
             <wp:extent cx="5943600" cy="1765300"/>
             <wp:effectExtent b="0" l="0" r="0" t="0"/>
-            <wp:docPr id="23" name="image19.png"/>
+            <wp:docPr id="23" name="image18.png"/>
             <a:graphic>
               <a:graphicData uri="http://schemas.openxmlformats.org/drawingml/2006/picture">
                 <pic:pic>
                   <pic:nvPicPr>
-                    <pic:cNvPr id="0" name="image19.png"/>
+                    <pic:cNvPr id="0" name="image18.png"/>
                     <pic:cNvPicPr preferRelativeResize="0"/>
                   </pic:nvPicPr>
                   <pic:blipFill>
@@ -5013,12 +4851,12 @@
           <wp:inline distB="114300" distT="114300" distL="114300" distR="114300">
             <wp:extent cx="5624513" cy="800100"/>
             <wp:effectExtent b="0" l="0" r="0" t="0"/>
-            <wp:docPr id="6" name="image7.png"/>
+            <wp:docPr id="6" name="image22.png"/>
             <a:graphic>
               <a:graphicData uri="http://schemas.openxmlformats.org/drawingml/2006/picture">
                 <pic:pic>
                   <pic:nvPicPr>
-                    <pic:cNvPr id="0" name="image7.png"/>
+                    <pic:cNvPr id="0" name="image22.png"/>
                     <pic:cNvPicPr preferRelativeResize="0"/>
                   </pic:nvPicPr>
                   <pic:blipFill>
@@ -5095,12 +4933,12 @@
           <wp:inline distB="114300" distT="114300" distL="114300" distR="114300">
             <wp:extent cx="5719763" cy="809625"/>
             <wp:effectExtent b="0" l="0" r="0" t="0"/>
-            <wp:docPr id="11" name="image24.png"/>
+            <wp:docPr id="11" name="image10.png"/>
             <a:graphic>
               <a:graphicData uri="http://schemas.openxmlformats.org/drawingml/2006/picture">
                 <pic:pic>
                   <pic:nvPicPr>
-                    <pic:cNvPr id="0" name="image24.png"/>
+                    <pic:cNvPr id="0" name="image10.png"/>
                     <pic:cNvPicPr preferRelativeResize="0"/>
                   </pic:nvPicPr>
                   <pic:blipFill>
@@ -5156,12 +4994,12 @@
           <wp:inline distB="114300" distT="114300" distL="114300" distR="114300">
             <wp:extent cx="3448050" cy="2575832"/>
             <wp:effectExtent b="0" l="0" r="0" t="0"/>
-            <wp:docPr id="19" name="image9.png"/>
+            <wp:docPr id="19" name="image5.png"/>
             <a:graphic>
               <a:graphicData uri="http://schemas.openxmlformats.org/drawingml/2006/picture">
                 <pic:pic>
                   <pic:nvPicPr>
-                    <pic:cNvPr id="0" name="image9.png"/>
+                    <pic:cNvPr id="0" name="image5.png"/>
                     <pic:cNvPicPr preferRelativeResize="0"/>
                   </pic:nvPicPr>
                   <pic:blipFill>
@@ -5224,7 +5062,7 @@
       <w:pPr>
         <w:numPr>
           <w:ilvl w:val="0"/>
-          <w:numId w:val="21"/>
+          <w:numId w:val="20"/>
         </w:numPr>
         <w:shd w:fill="ffffff" w:val="clear"/>
         <w:spacing w:after="0" w:afterAutospacing="0" w:before="240" w:lineRule="auto"/>
@@ -5247,7 +5085,7 @@
       <w:pPr>
         <w:numPr>
           <w:ilvl w:val="0"/>
-          <w:numId w:val="21"/>
+          <w:numId w:val="20"/>
         </w:numPr>
         <w:shd w:fill="ffffff" w:val="clear"/>
         <w:spacing w:after="240" w:before="0" w:beforeAutospacing="0" w:lineRule="auto"/>
@@ -5651,12 +5489,12 @@
           <wp:inline distB="114300" distT="114300" distL="114300" distR="114300">
             <wp:extent cx="2814638" cy="2609850"/>
             <wp:effectExtent b="0" l="0" r="0" t="0"/>
-            <wp:docPr id="8" name="image10.png"/>
+            <wp:docPr id="8" name="image14.png"/>
             <a:graphic>
               <a:graphicData uri="http://schemas.openxmlformats.org/drawingml/2006/picture">
                 <pic:pic>
                   <pic:nvPicPr>
-                    <pic:cNvPr id="0" name="image10.png"/>
+                    <pic:cNvPr id="0" name="image14.png"/>
                     <pic:cNvPicPr preferRelativeResize="0"/>
                   </pic:nvPicPr>
                   <pic:blipFill>
@@ -5750,12 +5588,12 @@
           <wp:inline distB="114300" distT="114300" distL="114300" distR="114300">
             <wp:extent cx="5086350" cy="3448050"/>
             <wp:effectExtent b="0" l="0" r="0" t="0"/>
-            <wp:docPr id="21" name="image21.png"/>
+            <wp:docPr id="21" name="image15.png"/>
             <a:graphic>
               <a:graphicData uri="http://schemas.openxmlformats.org/drawingml/2006/picture">
                 <pic:pic>
                   <pic:nvPicPr>
-                    <pic:cNvPr id="0" name="image21.png"/>
+                    <pic:cNvPr id="0" name="image15.png"/>
                     <pic:cNvPicPr preferRelativeResize="0"/>
                   </pic:nvPicPr>
                   <pic:blipFill>
@@ -5856,12 +5694,12 @@
           <wp:inline distB="114300" distT="114300" distL="114300" distR="114300">
             <wp:extent cx="5943600" cy="2641600"/>
             <wp:effectExtent b="0" l="0" r="0" t="0"/>
-            <wp:docPr id="28" name="image26.png"/>
+            <wp:docPr id="28" name="image27.png"/>
             <a:graphic>
               <a:graphicData uri="http://schemas.openxmlformats.org/drawingml/2006/picture">
                 <pic:pic>
                   <pic:nvPicPr>
-                    <pic:cNvPr id="0" name="image26.png"/>
+                    <pic:cNvPr id="0" name="image27.png"/>
                     <pic:cNvPicPr preferRelativeResize="0"/>
                   </pic:nvPicPr>
                   <pic:blipFill>
@@ -6967,7 +6805,7 @@
       <w:pPr>
         <w:numPr>
           <w:ilvl w:val="0"/>
-          <w:numId w:val="24"/>
+          <w:numId w:val="23"/>
         </w:numPr>
         <w:shd w:fill="ffffff" w:val="clear"/>
         <w:spacing w:after="0" w:afterAutospacing="0" w:before="240" w:lineRule="auto"/>
@@ -7010,7 +6848,7 @@
       <w:pPr>
         <w:numPr>
           <w:ilvl w:val="0"/>
-          <w:numId w:val="24"/>
+          <w:numId w:val="23"/>
         </w:numPr>
         <w:shd w:fill="ffffff" w:val="clear"/>
         <w:spacing w:after="240" w:before="0" w:beforeAutospacing="0" w:lineRule="auto"/>
@@ -7070,12 +6908,12 @@
           <wp:inline distB="114300" distT="114300" distL="114300" distR="114300">
             <wp:extent cx="5943600" cy="2692400"/>
             <wp:effectExtent b="0" l="0" r="0" t="0"/>
-            <wp:docPr id="14" name="image28.png"/>
+            <wp:docPr id="14" name="image26.png"/>
             <a:graphic>
               <a:graphicData uri="http://schemas.openxmlformats.org/drawingml/2006/picture">
                 <pic:pic>
                   <pic:nvPicPr>
-                    <pic:cNvPr id="0" name="image28.png"/>
+                    <pic:cNvPr id="0" name="image26.png"/>
                     <pic:cNvPicPr preferRelativeResize="0"/>
                   </pic:nvPicPr>
                   <pic:blipFill>
@@ -7109,7 +6947,7 @@
       <w:pPr>
         <w:numPr>
           <w:ilvl w:val="0"/>
-          <w:numId w:val="24"/>
+          <w:numId w:val="23"/>
         </w:numPr>
         <w:shd w:fill="ffffff" w:val="clear"/>
         <w:spacing w:after="0" w:afterAutospacing="0" w:before="240" w:lineRule="auto"/>
@@ -7172,7 +7010,7 @@
       <w:pPr>
         <w:numPr>
           <w:ilvl w:val="0"/>
-          <w:numId w:val="24"/>
+          <w:numId w:val="23"/>
         </w:numPr>
         <w:shd w:fill="ffffff" w:val="clear"/>
         <w:spacing w:after="0" w:afterAutospacing="0" w:before="0" w:beforeAutospacing="0" w:lineRule="auto"/>
@@ -7215,7 +7053,7 @@
       <w:pPr>
         <w:numPr>
           <w:ilvl w:val="0"/>
-          <w:numId w:val="24"/>
+          <w:numId w:val="23"/>
         </w:numPr>
         <w:shd w:fill="ffffff" w:val="clear"/>
         <w:spacing w:after="0" w:afterAutospacing="0" w:before="0" w:beforeAutospacing="0" w:lineRule="auto"/>
@@ -7238,7 +7076,7 @@
       <w:pPr>
         <w:numPr>
           <w:ilvl w:val="0"/>
-          <w:numId w:val="24"/>
+          <w:numId w:val="23"/>
         </w:numPr>
         <w:shd w:fill="ffffff" w:val="clear"/>
         <w:spacing w:after="240" w:before="0" w:beforeAutospacing="0" w:lineRule="auto"/>
@@ -7674,6 +7512,12 @@
           <w:t xml:space="preserve">Github Repo</w:t>
         </w:r>
       </w:hyperlink>
+      <w:r>
+        <w:rPr>
+          <w:rtl w:val="0"/>
+        </w:rPr>
+        <w:t xml:space="preserve"> .</w:t>
+      </w:r>
       <w:r>
         <w:rPr>
           <w:rtl w:val="0"/>
@@ -8003,7 +7847,7 @@
       <w:pPr>
         <w:numPr>
           <w:ilvl w:val="0"/>
-          <w:numId w:val="23"/>
+          <w:numId w:val="22"/>
         </w:numPr>
         <w:shd w:fill="ffffff" w:val="clear"/>
         <w:spacing w:after="0" w:afterAutospacing="0" w:before="240" w:lineRule="auto"/>
@@ -8049,7 +7893,7 @@
       <w:pPr>
         <w:numPr>
           <w:ilvl w:val="0"/>
-          <w:numId w:val="23"/>
+          <w:numId w:val="22"/>
         </w:numPr>
         <w:shd w:fill="ffffff" w:val="clear"/>
         <w:spacing w:after="240" w:before="0" w:beforeAutospacing="0" w:lineRule="auto"/>
@@ -8127,12 +7971,12 @@
           <wp:inline distB="114300" distT="114300" distL="114300" distR="114300">
             <wp:extent cx="3743325" cy="3686175"/>
             <wp:effectExtent b="0" l="0" r="0" t="0"/>
-            <wp:docPr id="2" name="image11.png"/>
+            <wp:docPr id="2" name="image21.png"/>
             <a:graphic>
               <a:graphicData uri="http://schemas.openxmlformats.org/drawingml/2006/picture">
                 <pic:pic>
                   <pic:nvPicPr>
-                    <pic:cNvPr id="0" name="image11.png"/>
+                    <pic:cNvPr id="0" name="image21.png"/>
                     <pic:cNvPicPr preferRelativeResize="0"/>
                   </pic:nvPicPr>
                   <pic:blipFill>
@@ -8166,7 +8010,7 @@
       <w:pPr>
         <w:numPr>
           <w:ilvl w:val="0"/>
-          <w:numId w:val="23"/>
+          <w:numId w:val="22"/>
         </w:numPr>
         <w:shd w:fill="ffffff" w:val="clear"/>
         <w:spacing w:after="240" w:before="240" w:lineRule="auto"/>
@@ -8240,12 +8084,12 @@
           <wp:inline distB="114300" distT="114300" distL="114300" distR="114300">
             <wp:extent cx="3191074" cy="3738563"/>
             <wp:effectExtent b="0" l="0" r="0" t="0"/>
-            <wp:docPr id="25" name="image18.png"/>
+            <wp:docPr id="25" name="image25.png"/>
             <a:graphic>
               <a:graphicData uri="http://schemas.openxmlformats.org/drawingml/2006/picture">
                 <pic:pic>
                   <pic:nvPicPr>
-                    <pic:cNvPr id="0" name="image18.png"/>
+                    <pic:cNvPr id="0" name="image25.png"/>
                     <pic:cNvPicPr preferRelativeResize="0"/>
                   </pic:nvPicPr>
                   <pic:blipFill>
@@ -8279,7 +8123,7 @@
       <w:pPr>
         <w:numPr>
           <w:ilvl w:val="0"/>
-          <w:numId w:val="23"/>
+          <w:numId w:val="22"/>
         </w:numPr>
         <w:shd w:fill="ffffff" w:val="clear"/>
         <w:spacing w:after="240" w:before="240" w:lineRule="auto"/>
@@ -8855,12 +8699,12 @@
           <wp:inline distB="114300" distT="114300" distL="114300" distR="114300">
             <wp:extent cx="2684625" cy="5824538"/>
             <wp:effectExtent b="0" l="0" r="0" t="0"/>
-            <wp:docPr id="5" name="image1.png"/>
+            <wp:docPr id="5" name="image17.png"/>
             <a:graphic>
               <a:graphicData uri="http://schemas.openxmlformats.org/drawingml/2006/picture">
                 <pic:pic>
                   <pic:nvPicPr>
-                    <pic:cNvPr id="0" name="image1.png"/>
+                    <pic:cNvPr id="0" name="image17.png"/>
                     <pic:cNvPicPr preferRelativeResize="0"/>
                   </pic:nvPicPr>
                   <pic:blipFill>
@@ -9081,12 +8925,12 @@
           <wp:inline distB="114300" distT="114300" distL="114300" distR="114300">
             <wp:extent cx="5229225" cy="762000"/>
             <wp:effectExtent b="0" l="0" r="0" t="0"/>
-            <wp:docPr id="13" name="image23.png"/>
+            <wp:docPr id="13" name="image6.png"/>
             <a:graphic>
               <a:graphicData uri="http://schemas.openxmlformats.org/drawingml/2006/picture">
                 <pic:pic>
                   <pic:nvPicPr>
-                    <pic:cNvPr id="0" name="image23.png"/>
+                    <pic:cNvPr id="0" name="image6.png"/>
                     <pic:cNvPicPr preferRelativeResize="0"/>
                   </pic:nvPicPr>
                   <pic:blipFill>
@@ -9133,12 +8977,12 @@
           <wp:inline distB="114300" distT="114300" distL="114300" distR="114300">
             <wp:extent cx="5233988" cy="3553190"/>
             <wp:effectExtent b="0" l="0" r="0" t="0"/>
-            <wp:docPr id="15" name="image5.png"/>
+            <wp:docPr id="15" name="image2.png"/>
             <a:graphic>
               <a:graphicData uri="http://schemas.openxmlformats.org/drawingml/2006/picture">
                 <pic:pic>
                   <pic:nvPicPr>
-                    <pic:cNvPr id="0" name="image5.png"/>
+                    <pic:cNvPr id="0" name="image2.png"/>
                     <pic:cNvPicPr preferRelativeResize="0"/>
                   </pic:nvPicPr>
                   <pic:blipFill>
@@ -9258,12 +9102,12 @@
           <wp:inline distB="114300" distT="114300" distL="114300" distR="114300">
             <wp:extent cx="5943600" cy="4051300"/>
             <wp:effectExtent b="0" l="0" r="0" t="0"/>
-            <wp:docPr id="4" name="image8.png"/>
+            <wp:docPr id="4" name="image3.png"/>
             <a:graphic>
               <a:graphicData uri="http://schemas.openxmlformats.org/drawingml/2006/picture">
                 <pic:pic>
                   <pic:nvPicPr>
-                    <pic:cNvPr id="0" name="image8.png"/>
+                    <pic:cNvPr id="0" name="image3.png"/>
                     <pic:cNvPicPr preferRelativeResize="0"/>
                   </pic:nvPicPr>
                   <pic:blipFill>
@@ -9447,12 +9291,12 @@
           <wp:inline distB="114300" distT="114300" distL="114300" distR="114300">
             <wp:extent cx="5943600" cy="3098800"/>
             <wp:effectExtent b="0" l="0" r="0" t="0"/>
-            <wp:docPr id="26" name="image25.png"/>
+            <wp:docPr id="26" name="image24.png"/>
             <a:graphic>
               <a:graphicData uri="http://schemas.openxmlformats.org/drawingml/2006/picture">
                 <pic:pic>
                   <pic:nvPicPr>
-                    <pic:cNvPr id="0" name="image25.png"/>
+                    <pic:cNvPr id="0" name="image24.png"/>
                     <pic:cNvPicPr preferRelativeResize="0"/>
                   </pic:nvPicPr>
                   <pic:blipFill>
@@ -9660,12 +9504,12 @@
           <wp:inline distB="114300" distT="114300" distL="114300" distR="114300">
             <wp:extent cx="5943600" cy="622300"/>
             <wp:effectExtent b="0" l="0" r="0" t="0"/>
-            <wp:docPr id="9" name="image6.png"/>
+            <wp:docPr id="9" name="image8.png"/>
             <a:graphic>
               <a:graphicData uri="http://schemas.openxmlformats.org/drawingml/2006/picture">
                 <pic:pic>
                   <pic:nvPicPr>
-                    <pic:cNvPr id="0" name="image6.png"/>
+                    <pic:cNvPr id="0" name="image8.png"/>
                     <pic:cNvPicPr preferRelativeResize="0"/>
                   </pic:nvPicPr>
                   <pic:blipFill>
@@ -10123,7 +9967,7 @@
                 <w:color w:val="24292e"/>
                 <w:rtl w:val="0"/>
               </w:rPr>
-              <w:t xml:space="preserve">alert.id</w:t>
+              <w:t xml:space="preserve">timestamp</w:t>
             </w:r>
           </w:p>
         </w:tc>
@@ -13630,7 +13474,7 @@
               <w:rPr>
                 <w:rtl w:val="0"/>
               </w:rPr>
-              <w:t xml:space="preserve">cve</w:t>
+              <w:t xml:space="preserve">timestamp</w:t>
             </w:r>
           </w:p>
         </w:tc>
@@ -15251,15 +15095,14 @@
           </w:tcPr>
           <w:p>
             <w:pPr>
-              <w:spacing w:line="240" w:lineRule="auto"/>
-              <w:ind w:left="0" w:firstLine="0"/>
-              <w:rPr/>
-            </w:pPr>
-            <w:r>
-              <w:rPr>
-                <w:rtl w:val="0"/>
-              </w:rPr>
-              <w:t xml:space="preserve">ip</w:t>
+              <w:ind w:left="0" w:firstLine="0"/>
+              <w:rPr/>
+            </w:pPr>
+            <w:r>
+              <w:rPr>
+                <w:rtl w:val="0"/>
+              </w:rPr>
+              <w:t xml:space="preserve">timestamp</w:t>
             </w:r>
           </w:p>
         </w:tc>
@@ -17752,632 +17595,15 @@
     <w:p>
       <w:pPr>
         <w:pStyle w:val="Heading1"/>
-        <w:spacing w:after="0" w:before="0" w:line="276" w:lineRule="auto"/>
+        <w:spacing w:after="0" w:before="0" w:line="240" w:lineRule="auto"/>
         <w:ind w:left="0" w:firstLine="0"/>
         <w:rPr>
           <w:rFonts w:ascii="Open Sans SemiBold" w:cs="Open Sans SemiBold" w:eastAsia="Open Sans SemiBold" w:hAnsi="Open Sans SemiBold"/>
           <w:color w:val="4a66ac"/>
         </w:rPr>
       </w:pPr>
-      <w:bookmarkStart w:colFirst="0" w:colLast="0" w:name="_x4qr0ilx77in" w:id="77"/>
+      <w:bookmarkStart w:colFirst="0" w:colLast="0" w:name="_nhtaij6jfaeu" w:id="77"/>
       <w:bookmarkEnd w:id="77"/>
-      <w:r>
-        <w:rPr>
-          <w:rFonts w:ascii="Open Sans SemiBold" w:cs="Open Sans SemiBold" w:eastAsia="Open Sans SemiBold" w:hAnsi="Open Sans SemiBold"/>
-          <w:color w:val="4a66ac"/>
-          <w:rtl w:val="0"/>
-        </w:rPr>
-        <w:t xml:space="preserve">Ontology Mapping</w:t>
-      </w:r>
-    </w:p>
-    <w:p>
-      <w:pPr>
-        <w:pStyle w:val="Heading1"/>
-        <w:spacing w:after="0" w:before="0" w:line="276" w:lineRule="auto"/>
-        <w:ind w:left="0" w:firstLine="0"/>
-        <w:rPr>
-          <w:rFonts w:ascii="Open Sans SemiBold" w:cs="Open Sans SemiBold" w:eastAsia="Open Sans SemiBold" w:hAnsi="Open Sans SemiBold"/>
-          <w:color w:val="1155cc"/>
-        </w:rPr>
-      </w:pPr>
-      <w:bookmarkStart w:colFirst="0" w:colLast="0" w:name="_6fm7irpkj2zo" w:id="78"/>
-      <w:bookmarkEnd w:id="78"/>
-      <w:r>
-        <w:pict>
-          <v:rect style="width:0.0pt;height:1.5pt" o:hr="t" o:hrstd="t" o:hralign="center" fillcolor="#A0A0A0" stroked="f"/>
-        </w:pict>
-      </w:r>
-      <w:r>
-        <w:rPr>
-          <w:rtl w:val="0"/>
-        </w:rPr>
-      </w:r>
-    </w:p>
-    <w:p>
-      <w:pPr>
-        <w:ind w:left="0" w:firstLine="0"/>
-        <w:rPr/>
-      </w:pPr>
-      <w:r>
-        <w:rPr>
-          <w:rtl w:val="0"/>
-        </w:rPr>
-        <w:t xml:space="preserve">Ontology mapping in Google SecOps SOAR enables automatic entity extraction and relationship building from GreyNoise Webhook and Connector data. This enhances threat intelligence correlation, investigation efficiency, and automated response capabilities.</w:t>
-      </w:r>
-    </w:p>
-    <w:p>
-      <w:pPr>
-        <w:pStyle w:val="Heading3"/>
-        <w:ind w:left="720" w:hanging="720"/>
-        <w:rPr/>
-      </w:pPr>
-      <w:bookmarkStart w:colFirst="0" w:colLast="0" w:name="_v0dowxx4kjex" w:id="79"/>
-      <w:bookmarkEnd w:id="79"/>
-      <w:r>
-        <w:rPr>
-          <w:rtl w:val="0"/>
-        </w:rPr>
-        <w:t xml:space="preserve">Import Ontology Manually</w:t>
-      </w:r>
-    </w:p>
-    <w:p>
-      <w:pPr>
-        <w:numPr>
-          <w:ilvl w:val="0"/>
-          <w:numId w:val="20"/>
-        </w:numPr>
-        <w:spacing w:after="0" w:afterAutospacing="0"/>
-        <w:ind w:left="720" w:hanging="360"/>
-        <w:rPr>
-          <w:u w:val="none"/>
-        </w:rPr>
-      </w:pPr>
-      <w:r>
-        <w:rPr>
-          <w:rtl w:val="0"/>
-        </w:rPr>
-        <w:t xml:space="preserve">Navigate to </w:t>
-      </w:r>
-      <w:r>
-        <w:rPr>
-          <w:b w:val="1"/>
-          <w:bCs w:val="1"/>
-          <w:rtl w:val="0"/>
-        </w:rPr>
-        <w:t xml:space="preserve">Settings -&gt; SOAR Settings -&gt; Ontology</w:t>
-      </w:r>
-    </w:p>
-    <w:p>
-      <w:pPr>
-        <w:numPr>
-          <w:ilvl w:val="0"/>
-          <w:numId w:val="20"/>
-        </w:numPr>
-        <w:spacing w:after="0" w:afterAutospacing="0"/>
-        <w:ind w:left="720" w:hanging="360"/>
-        <w:rPr/>
-      </w:pPr>
-      <w:r>
-        <w:rPr>
-          <w:rtl w:val="0"/>
-        </w:rPr>
-        <w:t xml:space="preserve">Open </w:t>
-      </w:r>
-      <w:r>
-        <w:rPr>
-          <w:b w:val="1"/>
-          <w:bCs w:val="1"/>
-          <w:rtl w:val="0"/>
-        </w:rPr>
-        <w:t xml:space="preserve">Ontology Status. </w:t>
-      </w:r>
-      <w:r>
-        <w:rPr>
-          <w:rtl w:val="0"/>
-        </w:rPr>
-        <w:t xml:space="preserve">Use the Import</w:t>
-      </w:r>
-      <w:r>
-        <w:rPr>
-          <w:b w:val="1"/>
-          <w:bCs w:val="1"/>
-          <w:rtl w:val="0"/>
-        </w:rPr>
-        <w:t xml:space="preserve"> </w:t>
-      </w:r>
-      <w:r>
-        <w:rPr>
-          <w:rtl w:val="0"/>
-        </w:rPr>
-        <w:t xml:space="preserve">option available on the right-hand side in the middle of the page.</w:t>
-      </w:r>
-    </w:p>
-    <w:p>
-      <w:pPr>
-        <w:numPr>
-          <w:ilvl w:val="0"/>
-          <w:numId w:val="20"/>
-        </w:numPr>
-        <w:ind w:left="720" w:hanging="360"/>
-        <w:rPr>
-          <w:u w:val="none"/>
-        </w:rPr>
-      </w:pPr>
-      <w:r>
-        <w:rPr>
-          <w:rtl w:val="0"/>
-        </w:rPr>
-        <w:t xml:space="preserve">Select the downloaded </w:t>
-      </w:r>
-      <w:hyperlink r:id="rId38">
-        <w:r>
-          <w:rPr>
-            <w:color w:val="1155cc"/>
-            <w:u w:val="single"/>
-            <w:rtl w:val="0"/>
-          </w:rPr>
-          <w:t xml:space="preserve">Ontology zip</w:t>
-        </w:r>
-      </w:hyperlink>
-      <w:r>
-        <w:rPr>
-          <w:b w:val="1"/>
-          <w:bCs w:val="1"/>
-          <w:rtl w:val="0"/>
-        </w:rPr>
-        <w:t xml:space="preserve">. </w:t>
-      </w:r>
-      <w:r>
-        <w:rPr>
-          <w:rtl w:val="0"/>
-        </w:rPr>
-        <w:t xml:space="preserve">It will be imported.</w:t>
-      </w:r>
-    </w:p>
-    <w:p>
-      <w:pPr>
-        <w:ind w:left="0" w:firstLine="0"/>
-        <w:rPr/>
-      </w:pPr>
-      <w:r>
-        <w:rPr>
-          <w:b w:val="1"/>
-          <w:bCs w:val="1"/>
-          <w:rtl w:val="0"/>
-        </w:rPr>
-        <w:t xml:space="preserve">Note: </w:t>
-      </w:r>
-      <w:r>
-        <w:rPr>
-          <w:rtl w:val="0"/>
-        </w:rPr>
-        <w:t xml:space="preserve">Ontology will be bundled as part of the integration once it gets published officially.</w:t>
-      </w:r>
-      <w:r>
-        <w:rPr>
-          <w:rtl w:val="0"/>
-        </w:rPr>
-      </w:r>
-    </w:p>
-    <w:p>
-      <w:pPr>
-        <w:pStyle w:val="Heading3"/>
-        <w:ind w:left="720" w:hanging="720"/>
-        <w:rPr>
-          <w:sz w:val="28"/>
-          <w:szCs w:val="28"/>
-        </w:rPr>
-      </w:pPr>
-      <w:bookmarkStart w:colFirst="0" w:colLast="0" w:name="_u7b48s4x8vnn" w:id="80"/>
-      <w:bookmarkEnd w:id="80"/>
-      <w:r>
-        <w:rPr>
-          <w:rtl w:val="0"/>
-        </w:rPr>
-        <w:t xml:space="preserve">Ontology Mapping Table</w:t>
-      </w:r>
-      <w:r>
-        <w:rPr>
-          <w:rtl w:val="0"/>
-        </w:rPr>
-      </w:r>
-    </w:p>
-    <w:tbl>
-      <w:tblPr>
-        <w:tblStyle w:val="Table13"/>
-        <w:tblW w:w="4890.0" w:type="dxa"/>
-        <w:jc w:val="left"/>
-        <w:tblBorders>
-          <w:top w:color="000000" w:space="0" w:sz="0" w:val="nil"/>
-          <w:left w:color="000000" w:space="0" w:sz="0" w:val="nil"/>
-          <w:bottom w:color="000000" w:space="0" w:sz="0" w:val="nil"/>
-          <w:right w:color="000000" w:space="0" w:sz="0" w:val="nil"/>
-          <w:insideH w:color="000000" w:space="0" w:sz="0" w:val="nil"/>
-          <w:insideV w:color="000000" w:space="0" w:sz="0" w:val="nil"/>
-        </w:tblBorders>
-        <w:tblLayout w:type="fixed"/>
-        <w:tblLook w:val="0600"/>
-      </w:tblPr>
-      <w:tblGrid>
-        <w:gridCol w:w="2730"/>
-        <w:gridCol w:w="2160"/>
-        <w:tblGridChange w:id="0">
-          <w:tblGrid>
-            <w:gridCol w:w="2730"/>
-            <w:gridCol w:w="2160"/>
-          </w:tblGrid>
-        </w:tblGridChange>
-      </w:tblGrid>
-      <w:tr>
-        <w:trPr>
-          <w:cantSplit w:val="0"/>
-          <w:trHeight w:val="345" w:hRule="atLeast"/>
-          <w:tblHeader w:val="0"/>
-        </w:trPr>
-        <w:tc>
-          <w:tcPr>
-            <w:tcBorders>
-              <w:top w:color="000000" w:space="0" w:sz="8" w:val="single"/>
-              <w:left w:color="000000" w:space="0" w:sz="8" w:val="single"/>
-              <w:bottom w:color="000000" w:space="0" w:sz="8" w:val="single"/>
-              <w:right w:color="000000" w:space="0" w:sz="8" w:val="single"/>
-            </w:tcBorders>
-            <w:tcMar>
-              <w:top w:w="80.0" w:type="dxa"/>
-              <w:left w:w="160.0" w:type="dxa"/>
-              <w:bottom w:w="80.0" w:type="dxa"/>
-              <w:right w:w="160.0" w:type="dxa"/>
-            </w:tcMar>
-            <w:vAlign w:val="top"/>
-          </w:tcPr>
-          <w:p>
-            <w:pPr>
-              <w:shd w:fill="auto" w:val="clear"/>
-              <w:spacing w:after="0" w:lineRule="auto"/>
-              <w:ind w:left="0" w:firstLine="0"/>
-              <w:rPr>
-                <w:b w:val="1"/>
-                <w:bCs w:val="1"/>
-                <w:color w:val="000000"/>
-                <w:sz w:val="22"/>
-                <w:szCs w:val="22"/>
-              </w:rPr>
-            </w:pPr>
-            <w:r>
-              <w:rPr>
-                <w:b w:val="1"/>
-                <w:bCs w:val="1"/>
-                <w:color w:val="000000"/>
-                <w:sz w:val="22"/>
-                <w:szCs w:val="22"/>
-                <w:rtl w:val="0"/>
-              </w:rPr>
-              <w:t xml:space="preserve">Entity Field</w:t>
-            </w:r>
-          </w:p>
-        </w:tc>
-        <w:tc>
-          <w:tcPr>
-            <w:tcBorders>
-              <w:top w:color="000000" w:space="0" w:sz="8" w:val="single"/>
-              <w:left w:color="000000" w:space="0" w:sz="8" w:val="single"/>
-              <w:bottom w:color="000000" w:space="0" w:sz="8" w:val="single"/>
-              <w:right w:color="000000" w:space="0" w:sz="8" w:val="single"/>
-            </w:tcBorders>
-            <w:tcMar>
-              <w:top w:w="80.0" w:type="dxa"/>
-              <w:left w:w="160.0" w:type="dxa"/>
-              <w:bottom w:w="80.0" w:type="dxa"/>
-              <w:right w:w="160.0" w:type="dxa"/>
-            </w:tcMar>
-            <w:vAlign w:val="top"/>
-          </w:tcPr>
-          <w:p>
-            <w:pPr>
-              <w:shd w:fill="auto" w:val="clear"/>
-              <w:spacing w:after="0" w:lineRule="auto"/>
-              <w:ind w:left="0" w:firstLine="0"/>
-              <w:rPr>
-                <w:b w:val="1"/>
-                <w:bCs w:val="1"/>
-                <w:color w:val="000000"/>
-                <w:sz w:val="22"/>
-                <w:szCs w:val="22"/>
-              </w:rPr>
-            </w:pPr>
-            <w:r>
-              <w:rPr>
-                <w:b w:val="1"/>
-                <w:bCs w:val="1"/>
-                <w:color w:val="000000"/>
-                <w:sz w:val="22"/>
-                <w:szCs w:val="22"/>
-                <w:rtl w:val="0"/>
-              </w:rPr>
-              <w:t xml:space="preserve">Source Field(s)</w:t>
-            </w:r>
-          </w:p>
-        </w:tc>
-      </w:tr>
-      <w:tr>
-        <w:trPr>
-          <w:cantSplit w:val="0"/>
-          <w:trHeight w:val="375" w:hRule="atLeast"/>
-          <w:tblHeader w:val="0"/>
-        </w:trPr>
-        <w:tc>
-          <w:tcPr>
-            <w:tcBorders>
-              <w:top w:color="000000" w:space="0" w:sz="8" w:val="single"/>
-              <w:left w:color="000000" w:space="0" w:sz="8" w:val="single"/>
-              <w:bottom w:color="000000" w:space="0" w:sz="8" w:val="single"/>
-              <w:right w:color="000000" w:space="0" w:sz="8" w:val="single"/>
-            </w:tcBorders>
-            <w:tcMar>
-              <w:top w:w="80.0" w:type="dxa"/>
-              <w:left w:w="160.0" w:type="dxa"/>
-              <w:bottom w:w="80.0" w:type="dxa"/>
-              <w:right w:w="160.0" w:type="dxa"/>
-            </w:tcMar>
-            <w:vAlign w:val="top"/>
-          </w:tcPr>
-          <w:p>
-            <w:pPr>
-              <w:shd w:fill="auto" w:val="clear"/>
-              <w:spacing w:after="0" w:lineRule="auto"/>
-              <w:ind w:left="0" w:firstLine="0"/>
-              <w:rPr>
-                <w:color w:val="000000"/>
-                <w:sz w:val="22"/>
-                <w:szCs w:val="22"/>
-              </w:rPr>
-            </w:pPr>
-            <w:r>
-              <w:rPr>
-                <w:color w:val="000000"/>
-                <w:sz w:val="22"/>
-                <w:szCs w:val="22"/>
-                <w:rtl w:val="0"/>
-              </w:rPr>
-              <w:t xml:space="preserve">SourceAddress</w:t>
-            </w:r>
-          </w:p>
-        </w:tc>
-        <w:tc>
-          <w:tcPr>
-            <w:tcBorders>
-              <w:top w:color="000000" w:space="0" w:sz="8" w:val="single"/>
-              <w:left w:color="000000" w:space="0" w:sz="8" w:val="single"/>
-              <w:bottom w:color="000000" w:space="0" w:sz="8" w:val="single"/>
-              <w:right w:color="000000" w:space="0" w:sz="8" w:val="single"/>
-            </w:tcBorders>
-            <w:tcMar>
-              <w:top w:w="80.0" w:type="dxa"/>
-              <w:left w:w="160.0" w:type="dxa"/>
-              <w:bottom w:w="80.0" w:type="dxa"/>
-              <w:right w:w="160.0" w:type="dxa"/>
-            </w:tcMar>
-            <w:vAlign w:val="top"/>
-          </w:tcPr>
-          <w:p>
-            <w:pPr>
-              <w:shd w:fill="auto" w:val="clear"/>
-              <w:spacing w:after="0" w:lineRule="auto"/>
-              <w:ind w:left="0" w:firstLine="0"/>
-              <w:rPr>
-                <w:color w:val="000000"/>
-                <w:sz w:val="22"/>
-                <w:szCs w:val="22"/>
-              </w:rPr>
-            </w:pPr>
-            <w:r>
-              <w:rPr>
-                <w:color w:val="000000"/>
-                <w:sz w:val="22"/>
-                <w:szCs w:val="22"/>
-                <w:rtl w:val="0"/>
-              </w:rPr>
-              <w:t xml:space="preserve">ip</w:t>
-            </w:r>
-          </w:p>
-        </w:tc>
-      </w:tr>
-      <w:tr>
-        <w:trPr>
-          <w:cantSplit w:val="0"/>
-          <w:trHeight w:val="195" w:hRule="atLeast"/>
-          <w:tblHeader w:val="0"/>
-        </w:trPr>
-        <w:tc>
-          <w:tcPr>
-            <w:tcBorders>
-              <w:top w:color="000000" w:space="0" w:sz="8" w:val="single"/>
-              <w:left w:color="000000" w:space="0" w:sz="8" w:val="single"/>
-              <w:bottom w:color="000000" w:space="0" w:sz="8" w:val="single"/>
-              <w:right w:color="000000" w:space="0" w:sz="8" w:val="single"/>
-            </w:tcBorders>
-            <w:tcMar>
-              <w:top w:w="80.0" w:type="dxa"/>
-              <w:left w:w="160.0" w:type="dxa"/>
-              <w:bottom w:w="80.0" w:type="dxa"/>
-              <w:right w:w="160.0" w:type="dxa"/>
-            </w:tcMar>
-            <w:vAlign w:val="top"/>
-          </w:tcPr>
-          <w:p>
-            <w:pPr>
-              <w:shd w:fill="auto" w:val="clear"/>
-              <w:spacing w:after="0" w:lineRule="auto"/>
-              <w:ind w:left="0" w:firstLine="0"/>
-              <w:rPr>
-                <w:color w:val="000000"/>
-                <w:sz w:val="22"/>
-                <w:szCs w:val="22"/>
-              </w:rPr>
-            </w:pPr>
-            <w:r>
-              <w:rPr>
-                <w:color w:val="000000"/>
-                <w:sz w:val="22"/>
-                <w:szCs w:val="22"/>
-                <w:rtl w:val="0"/>
-              </w:rPr>
-              <w:t xml:space="preserve">CVE</w:t>
-            </w:r>
-          </w:p>
-        </w:tc>
-        <w:tc>
-          <w:tcPr>
-            <w:tcBorders>
-              <w:top w:color="000000" w:space="0" w:sz="8" w:val="single"/>
-              <w:left w:color="000000" w:space="0" w:sz="8" w:val="single"/>
-              <w:bottom w:color="000000" w:space="0" w:sz="8" w:val="single"/>
-              <w:right w:color="000000" w:space="0" w:sz="8" w:val="single"/>
-            </w:tcBorders>
-            <w:tcMar>
-              <w:top w:w="80.0" w:type="dxa"/>
-              <w:left w:w="160.0" w:type="dxa"/>
-              <w:bottom w:w="80.0" w:type="dxa"/>
-              <w:right w:w="160.0" w:type="dxa"/>
-            </w:tcMar>
-            <w:vAlign w:val="top"/>
-          </w:tcPr>
-          <w:p>
-            <w:pPr>
-              <w:shd w:fill="auto" w:val="clear"/>
-              <w:spacing w:after="0" w:lineRule="auto"/>
-              <w:ind w:left="0" w:firstLine="0"/>
-              <w:rPr>
-                <w:color w:val="000000"/>
-                <w:sz w:val="22"/>
-                <w:szCs w:val="22"/>
-              </w:rPr>
-            </w:pPr>
-            <w:r>
-              <w:rPr>
-                <w:color w:val="000000"/>
-                <w:sz w:val="22"/>
-                <w:szCs w:val="22"/>
-                <w:rtl w:val="0"/>
-              </w:rPr>
-              <w:t xml:space="preserve">cve</w:t>
-            </w:r>
-          </w:p>
-        </w:tc>
-      </w:tr>
-    </w:tbl>
-    <w:p>
-      <w:pPr>
-        <w:pStyle w:val="Heading2"/>
-        <w:ind w:left="0" w:firstLine="0"/>
-        <w:rPr>
-          <w:color w:val="4a66ac"/>
-        </w:rPr>
-      </w:pPr>
-      <w:bookmarkStart w:colFirst="0" w:colLast="0" w:name="_23dbokk0bxiy" w:id="81"/>
-      <w:bookmarkEnd w:id="81"/>
-      <w:r>
-        <w:rPr>
-          <w:rtl w:val="0"/>
-        </w:rPr>
-      </w:r>
-    </w:p>
-    <w:p>
-      <w:pPr>
-        <w:pStyle w:val="Heading2"/>
-        <w:ind w:left="0" w:firstLine="720"/>
-        <w:rPr>
-          <w:color w:val="4a66ac"/>
-        </w:rPr>
-      </w:pPr>
-      <w:bookmarkStart w:colFirst="0" w:colLast="0" w:name="_7w3nks1na7fb" w:id="82"/>
-      <w:bookmarkEnd w:id="82"/>
-      <w:r>
-        <w:rPr>
-          <w:rtl w:val="0"/>
-        </w:rPr>
-      </w:r>
-    </w:p>
-    <w:p>
-      <w:pPr>
-        <w:pStyle w:val="Heading2"/>
-        <w:ind w:left="0" w:firstLine="720"/>
-        <w:rPr>
-          <w:color w:val="4a66ac"/>
-        </w:rPr>
-      </w:pPr>
-      <w:bookmarkStart w:colFirst="0" w:colLast="0" w:name="_to2hr1veljvy" w:id="83"/>
-      <w:bookmarkEnd w:id="83"/>
-      <w:r>
-        <w:rPr>
-          <w:rtl w:val="0"/>
-        </w:rPr>
-      </w:r>
-    </w:p>
-    <w:p>
-      <w:pPr>
-        <w:pStyle w:val="Heading2"/>
-        <w:ind w:left="0" w:firstLine="720"/>
-        <w:rPr>
-          <w:color w:val="4a66ac"/>
-        </w:rPr>
-      </w:pPr>
-      <w:bookmarkStart w:colFirst="0" w:colLast="0" w:name="_5egii2uw9a39" w:id="84"/>
-      <w:bookmarkEnd w:id="84"/>
-      <w:r>
-        <w:rPr>
-          <w:rtl w:val="0"/>
-        </w:rPr>
-      </w:r>
-    </w:p>
-    <w:p>
-      <w:pPr>
-        <w:pStyle w:val="Heading2"/>
-        <w:ind w:left="0" w:firstLine="720"/>
-        <w:rPr>
-          <w:color w:val="4a66ac"/>
-        </w:rPr>
-      </w:pPr>
-      <w:bookmarkStart w:colFirst="0" w:colLast="0" w:name="_c6kwesx0742c" w:id="85"/>
-      <w:bookmarkEnd w:id="85"/>
-      <w:r>
-        <w:rPr>
-          <w:rtl w:val="0"/>
-        </w:rPr>
-      </w:r>
-    </w:p>
-    <w:p>
-      <w:pPr>
-        <w:pStyle w:val="Heading2"/>
-        <w:ind w:left="0" w:firstLine="720"/>
-        <w:rPr>
-          <w:rFonts w:ascii="Open Sans SemiBold" w:cs="Open Sans SemiBold" w:eastAsia="Open Sans SemiBold" w:hAnsi="Open Sans SemiBold"/>
-          <w:color w:val="4a66ac"/>
-        </w:rPr>
-      </w:pPr>
-      <w:bookmarkStart w:colFirst="0" w:colLast="0" w:name="_btcoyywm7boq" w:id="86"/>
-      <w:bookmarkEnd w:id="86"/>
-      <w:r>
-        <w:br w:type="page"/>
-      </w:r>
-      <w:r>
-        <w:rPr>
-          <w:rtl w:val="0"/>
-        </w:rPr>
-      </w:r>
-    </w:p>
-    <w:p>
-      <w:pPr>
-        <w:pStyle w:val="Heading1"/>
-        <w:spacing w:after="0" w:before="0" w:line="240" w:lineRule="auto"/>
-        <w:ind w:left="0" w:firstLine="0"/>
-        <w:rPr>
-          <w:rFonts w:ascii="Open Sans SemiBold" w:cs="Open Sans SemiBold" w:eastAsia="Open Sans SemiBold" w:hAnsi="Open Sans SemiBold"/>
-          <w:color w:val="4a66ac"/>
-        </w:rPr>
-      </w:pPr>
-      <w:bookmarkStart w:colFirst="0" w:colLast="0" w:name="_nhtaij6jfaeu" w:id="87"/>
-      <w:bookmarkEnd w:id="87"/>
       <w:r>
         <w:rPr>
           <w:rFonts w:ascii="Open Sans SemiBold" w:cs="Open Sans SemiBold" w:eastAsia="Open Sans SemiBold" w:hAnsi="Open Sans SemiBold"/>
@@ -18402,8 +17628,8 @@
           <w:szCs w:val="16"/>
         </w:rPr>
       </w:pPr>
-      <w:bookmarkStart w:colFirst="0" w:colLast="0" w:name="_f3l653eh70zr" w:id="88"/>
-      <w:bookmarkEnd w:id="88"/>
+      <w:bookmarkStart w:colFirst="0" w:colLast="0" w:name="_f3l653eh70zr" w:id="78"/>
+      <w:bookmarkEnd w:id="78"/>
       <w:r>
         <w:pict>
           <v:rect style="width:0.0pt;height:1.5pt" o:hr="t" o:hrstd="t" o:hralign="center" fillcolor="#A0A0A0" stroked="f"/>
@@ -18528,7 +17754,7 @@
         </w:rPr>
         <w:t xml:space="preserve"> field for webhooks, even though Priority is an enum field and the direct mapping will not produce the expected results. The webhook expression builder in Google SecOps does not support nested if-else logic for mapping multiple classification values to priority levels (e.g., mapping “malicious → CRITICAL”, “suspicious → HIGH”, etc.), as discussed in the </w:t>
       </w:r>
-      <w:hyperlink r:id="rId39">
+      <w:hyperlink r:id="rId38">
         <w:r>
           <w:rPr>
             <w:color w:val="1155cc"/>
@@ -18579,8 +17805,8 @@
           <w:color w:val="4a66ac"/>
         </w:rPr>
       </w:pPr>
-      <w:bookmarkStart w:colFirst="0" w:colLast="0" w:name="_b1mhuomg7cjj" w:id="89"/>
-      <w:bookmarkEnd w:id="89"/>
+      <w:bookmarkStart w:colFirst="0" w:colLast="0" w:name="_b1mhuomg7cjj" w:id="79"/>
+      <w:bookmarkEnd w:id="79"/>
       <w:r>
         <w:rPr>
           <w:rtl w:val="0"/>
@@ -18597,8 +17823,8 @@
           <w:color w:val="4a66ac"/>
         </w:rPr>
       </w:pPr>
-      <w:bookmarkStart w:colFirst="0" w:colLast="0" w:name="_f54pwcagvdtk" w:id="90"/>
-      <w:bookmarkEnd w:id="90"/>
+      <w:bookmarkStart w:colFirst="0" w:colLast="0" w:name="_f54pwcagvdtk" w:id="80"/>
+      <w:bookmarkEnd w:id="80"/>
       <w:r>
         <w:br w:type="page"/>
       </w:r>
@@ -18619,8 +17845,8 @@
           <w:color w:val="4a66ac"/>
         </w:rPr>
       </w:pPr>
-      <w:bookmarkStart w:colFirst="0" w:colLast="0" w:name="_a28jcsuhobbo" w:id="91"/>
-      <w:bookmarkEnd w:id="91"/>
+      <w:bookmarkStart w:colFirst="0" w:colLast="0" w:name="_a28jcsuhobbo" w:id="81"/>
+      <w:bookmarkEnd w:id="81"/>
       <w:r>
         <w:rPr>
           <w:rFonts w:ascii="Open Sans SemiBold" w:cs="Open Sans SemiBold" w:eastAsia="Open Sans SemiBold" w:hAnsi="Open Sans SemiBold"/>
@@ -18645,8 +17871,8 @@
           <w:szCs w:val="2"/>
         </w:rPr>
       </w:pPr>
-      <w:bookmarkStart w:colFirst="0" w:colLast="0" w:name="_9k1zzj2spqmq" w:id="92"/>
-      <w:bookmarkEnd w:id="92"/>
+      <w:bookmarkStart w:colFirst="0" w:colLast="0" w:name="_9k1zzj2spqmq" w:id="82"/>
+      <w:bookmarkEnd w:id="82"/>
       <w:r>
         <w:pict>
           <v:rect style="width:0.0pt;height:1.5pt" o:hr="t" o:hrstd="t" o:hralign="center" fillcolor="#A0A0A0" stroked="f"/>
@@ -18716,7 +17942,7 @@
         </w:rPr>
         <w:t xml:space="preserve">: </w:t>
       </w:r>
-      <w:hyperlink r:id="rId40">
+      <w:hyperlink r:id="rId39">
         <w:r>
           <w:rPr>
             <w:color w:val="1155cc"/>
@@ -18781,8 +18007,8 @@
           <w:color w:val="4a66ac"/>
         </w:rPr>
       </w:pPr>
-      <w:bookmarkStart w:colFirst="0" w:colLast="0" w:name="_oyi1w5qnmu8n" w:id="93"/>
-      <w:bookmarkEnd w:id="93"/>
+      <w:bookmarkStart w:colFirst="0" w:colLast="0" w:name="_oyi1w5qnmu8n" w:id="83"/>
+      <w:bookmarkEnd w:id="83"/>
       <w:r>
         <w:rPr>
           <w:rtl w:val="0"/>
@@ -18800,8 +18026,8 @@
           <w:color w:val="4a66ac"/>
         </w:rPr>
       </w:pPr>
-      <w:bookmarkStart w:colFirst="0" w:colLast="0" w:name="_j127l6lgqx82" w:id="94"/>
-      <w:bookmarkEnd w:id="94"/>
+      <w:bookmarkStart w:colFirst="0" w:colLast="0" w:name="_j127l6lgqx82" w:id="84"/>
+      <w:bookmarkEnd w:id="84"/>
       <w:r>
         <w:br w:type="page"/>
       </w:r>
@@ -18824,8 +18050,8 @@
           <w:color w:val="4a66ac"/>
         </w:rPr>
       </w:pPr>
-      <w:bookmarkStart w:colFirst="0" w:colLast="0" w:name="_w882fveee77" w:id="95"/>
-      <w:bookmarkEnd w:id="95"/>
+      <w:bookmarkStart w:colFirst="0" w:colLast="0" w:name="_w882fveee77" w:id="85"/>
+      <w:bookmarkEnd w:id="85"/>
       <w:r>
         <w:rPr>
           <w:rFonts w:ascii="Open Sans SemiBold" w:cs="Open Sans SemiBold" w:eastAsia="Open Sans SemiBold" w:hAnsi="Open Sans SemiBold"/>
@@ -18848,8 +18074,8 @@
         <w:jc w:val="both"/>
         <w:rPr/>
       </w:pPr>
-      <w:bookmarkStart w:colFirst="0" w:colLast="0" w:name="_rjmar5xy8sv0" w:id="96"/>
-      <w:bookmarkEnd w:id="96"/>
+      <w:bookmarkStart w:colFirst="0" w:colLast="0" w:name="_rjmar5xy8sv0" w:id="86"/>
+      <w:bookmarkEnd w:id="86"/>
       <w:r>
         <w:pict>
           <v:rect style="width:0.0pt;height:1.5pt" o:hr="t" o:hrstd="t" o:hralign="center" fillcolor="#A0A0A0" stroked="f"/>
@@ -18867,8 +18093,8 @@
         <w:ind w:left="720" w:hanging="360"/>
         <w:rPr/>
       </w:pPr>
-      <w:bookmarkStart w:colFirst="0" w:colLast="0" w:name="_rysyd05xg11x" w:id="97"/>
-      <w:bookmarkEnd w:id="97"/>
+      <w:bookmarkStart w:colFirst="0" w:colLast="0" w:name="_rysyd05xg11x" w:id="87"/>
+      <w:bookmarkEnd w:id="87"/>
       <w:r>
         <w:rPr>
           <w:rtl w:val="0"/>
@@ -18895,16 +18121,16 @@
           <wp:inline distB="114300" distT="114300" distL="114300" distR="114300">
             <wp:extent cx="5943600" cy="2286000"/>
             <wp:effectExtent b="0" l="0" r="0" t="0"/>
-            <wp:docPr id="12" name="image3.png"/>
+            <wp:docPr id="12" name="image23.png"/>
             <a:graphic>
               <a:graphicData uri="http://schemas.openxmlformats.org/drawingml/2006/picture">
                 <pic:pic>
                   <pic:nvPicPr>
-                    <pic:cNvPr id="0" name="image3.png"/>
+                    <pic:cNvPr id="0" name="image23.png"/>
                     <pic:cNvPicPr preferRelativeResize="0"/>
                   </pic:nvPicPr>
                   <pic:blipFill>
-                    <a:blip r:embed="rId41"/>
+                    <a:blip r:embed="rId40"/>
                     <a:srcRect b="0" l="0" r="0" t="0"/>
                     <a:stretch>
                       <a:fillRect/>
@@ -19057,16 +18283,16 @@
           <wp:inline distB="114300" distT="114300" distL="114300" distR="114300">
             <wp:extent cx="3100388" cy="5809817"/>
             <wp:effectExtent b="0" l="0" r="0" t="0"/>
-            <wp:docPr id="18" name="image2.png"/>
+            <wp:docPr id="18" name="image1.png"/>
             <a:graphic>
               <a:graphicData uri="http://schemas.openxmlformats.org/drawingml/2006/picture">
                 <pic:pic>
                   <pic:nvPicPr>
-                    <pic:cNvPr id="0" name="image2.png"/>
+                    <pic:cNvPr id="0" name="image1.png"/>
                     <pic:cNvPicPr preferRelativeResize="0"/>
                   </pic:nvPicPr>
                   <pic:blipFill>
-                    <a:blip r:embed="rId42"/>
+                    <a:blip r:embed="rId41"/>
                     <a:srcRect b="0" l="0" r="0" t="0"/>
                     <a:stretch>
                       <a:fillRect/>
@@ -19138,16 +18364,16 @@
           <wp:inline distB="114300" distT="114300" distL="114300" distR="114300">
             <wp:extent cx="5110875" cy="2893788"/>
             <wp:effectExtent b="0" l="0" r="0" t="0"/>
-            <wp:docPr id="24" name="image27.png"/>
+            <wp:docPr id="24" name="image28.png"/>
             <a:graphic>
               <a:graphicData uri="http://schemas.openxmlformats.org/drawingml/2006/picture">
                 <pic:pic>
                   <pic:nvPicPr>
-                    <pic:cNvPr id="0" name="image27.png"/>
+                    <pic:cNvPr id="0" name="image28.png"/>
                     <pic:cNvPicPr preferRelativeResize="0"/>
                   </pic:nvPicPr>
                   <pic:blipFill>
-                    <a:blip r:embed="rId43"/>
+                    <a:blip r:embed="rId42"/>
                     <a:srcRect b="0" l="0" r="0" t="0"/>
                     <a:stretch>
                       <a:fillRect/>
@@ -19202,8 +18428,8 @@
         <w:ind w:left="0" w:firstLine="0"/>
         <w:rPr/>
       </w:pPr>
-      <w:bookmarkStart w:colFirst="0" w:colLast="0" w:name="_3lqxa4vyibfz" w:id="98"/>
-      <w:bookmarkEnd w:id="98"/>
+      <w:bookmarkStart w:colFirst="0" w:colLast="0" w:name="_3lqxa4vyibfz" w:id="88"/>
+      <w:bookmarkEnd w:id="88"/>
       <w:r>
         <w:rPr>
           <w:rtl w:val="0"/>
@@ -19222,16 +18448,16 @@
           <wp:inline distB="114300" distT="114300" distL="114300" distR="114300">
             <wp:extent cx="5943600" cy="2133600"/>
             <wp:effectExtent b="0" l="0" r="0" t="0"/>
-            <wp:docPr id="1" name="image15.png"/>
+            <wp:docPr id="1" name="image11.png"/>
             <a:graphic>
               <a:graphicData uri="http://schemas.openxmlformats.org/drawingml/2006/picture">
                 <pic:pic>
                   <pic:nvPicPr>
-                    <pic:cNvPr id="0" name="image15.png"/>
+                    <pic:cNvPr id="0" name="image11.png"/>
                     <pic:cNvPicPr preferRelativeResize="0"/>
                   </pic:nvPicPr>
                   <pic:blipFill>
-                    <a:blip r:embed="rId44"/>
+                    <a:blip r:embed="rId43"/>
                     <a:srcRect b="0" l="0" r="0" t="0"/>
                     <a:stretch>
                       <a:fillRect/>
@@ -19313,7 +18539,7 @@
       </w:r>
     </w:p>
     <w:sectPr>
-      <w:headerReference r:id="rId45" w:type="default"/>
+      <w:headerReference r:id="rId44" w:type="default"/>
       <w:pgSz w:h="15840" w:w="12240" w:orient="portrait"/>
       <w:pgMar w:bottom="1440" w:top="1440" w:left="1440" w:right="1350" w:header="720" w:footer="720"/>
       <w:pgNumType w:start="1"/>
@@ -21480,13 +20706,17 @@
         <w:ind w:left="720" w:hanging="360"/>
       </w:pPr>
       <w:rPr>
+        <w:rFonts w:ascii="Arial" w:cs="Arial" w:eastAsia="Arial" w:hAnsi="Arial"/>
+        <w:color w:val="111111"/>
+        <w:sz w:val="24"/>
+        <w:szCs w:val="24"/>
         <w:u w:val="none"/>
       </w:rPr>
     </w:lvl>
     <w:lvl w:ilvl="1">
       <w:start w:val="1"/>
-      <w:numFmt w:val="bullet"/>
-      <w:lvlText w:val="○"/>
+      <w:numFmt w:val="lowerLetter"/>
+      <w:lvlText w:val="%2."/>
       <w:lvlJc w:val="left"/>
       <w:pPr>
         <w:ind w:left="1440" w:hanging="360"/>
@@ -21497,8 +20727,8 @@
     </w:lvl>
     <w:lvl w:ilvl="2">
       <w:start w:val="1"/>
-      <w:numFmt w:val="bullet"/>
-      <w:lvlText w:val="■"/>
+      <w:numFmt w:val="lowerRoman"/>
+      <w:lvlText w:val="%3."/>
       <w:lvlJc w:val="left"/>
       <w:pPr>
         <w:ind w:left="2160" w:hanging="360"/>
@@ -21509,8 +20739,8 @@
     </w:lvl>
     <w:lvl w:ilvl="3">
       <w:start w:val="1"/>
-      <w:numFmt w:val="bullet"/>
-      <w:lvlText w:val="●"/>
+      <w:numFmt w:val="decimal"/>
+      <w:lvlText w:val="%4."/>
       <w:lvlJc w:val="left"/>
       <w:pPr>
         <w:ind w:left="2880" w:hanging="360"/>
@@ -21521,8 +20751,8 @@
     </w:lvl>
     <w:lvl w:ilvl="4">
       <w:start w:val="1"/>
-      <w:numFmt w:val="bullet"/>
-      <w:lvlText w:val="○"/>
+      <w:numFmt w:val="lowerLetter"/>
+      <w:lvlText w:val="%5."/>
       <w:lvlJc w:val="left"/>
       <w:pPr>
         <w:ind w:left="3600" w:hanging="360"/>
@@ -21533,8 +20763,8 @@
     </w:lvl>
     <w:lvl w:ilvl="5">
       <w:start w:val="1"/>
-      <w:numFmt w:val="bullet"/>
-      <w:lvlText w:val="■"/>
+      <w:numFmt w:val="lowerRoman"/>
+      <w:lvlText w:val="%6."/>
       <w:lvlJc w:val="left"/>
       <w:pPr>
         <w:ind w:left="4320" w:hanging="360"/>
@@ -21545,8 +20775,8 @@
     </w:lvl>
     <w:lvl w:ilvl="6">
       <w:start w:val="1"/>
-      <w:numFmt w:val="bullet"/>
-      <w:lvlText w:val="●"/>
+      <w:numFmt w:val="decimal"/>
+      <w:lvlText w:val="%7."/>
       <w:lvlJc w:val="left"/>
       <w:pPr>
         <w:ind w:left="5040" w:hanging="360"/>
@@ -21557,8 +20787,8 @@
     </w:lvl>
     <w:lvl w:ilvl="7">
       <w:start w:val="1"/>
-      <w:numFmt w:val="bullet"/>
-      <w:lvlText w:val="○"/>
+      <w:numFmt w:val="lowerLetter"/>
+      <w:lvlText w:val="%8."/>
       <w:lvlJc w:val="left"/>
       <w:pPr>
         <w:ind w:left="5760" w:hanging="360"/>
@@ -21569,8 +20799,8 @@
     </w:lvl>
     <w:lvl w:ilvl="8">
       <w:start w:val="1"/>
-      <w:numFmt w:val="bullet"/>
-      <w:lvlText w:val="■"/>
+      <w:numFmt w:val="lowerRoman"/>
+      <w:lvlText w:val="%9."/>
       <w:lvlJc w:val="left"/>
       <w:pPr>
         <w:ind w:left="6480" w:hanging="360"/>
@@ -21585,6 +20815,116 @@
       <w:start w:val="1"/>
       <w:numFmt w:val="bullet"/>
       <w:lvlText w:val="●"/>
+      <w:lvlJc w:val="left"/>
+      <w:pPr>
+        <w:ind w:left="720" w:hanging="360"/>
+      </w:pPr>
+      <w:rPr>
+        <w:u w:val="none"/>
+      </w:rPr>
+    </w:lvl>
+    <w:lvl w:ilvl="1">
+      <w:start w:val="1"/>
+      <w:numFmt w:val="bullet"/>
+      <w:lvlText w:val="○"/>
+      <w:lvlJc w:val="left"/>
+      <w:pPr>
+        <w:ind w:left="1440" w:hanging="360"/>
+      </w:pPr>
+      <w:rPr>
+        <w:u w:val="none"/>
+      </w:rPr>
+    </w:lvl>
+    <w:lvl w:ilvl="2">
+      <w:start w:val="1"/>
+      <w:numFmt w:val="bullet"/>
+      <w:lvlText w:val="■"/>
+      <w:lvlJc w:val="left"/>
+      <w:pPr>
+        <w:ind w:left="2160" w:hanging="360"/>
+      </w:pPr>
+      <w:rPr>
+        <w:u w:val="none"/>
+      </w:rPr>
+    </w:lvl>
+    <w:lvl w:ilvl="3">
+      <w:start w:val="1"/>
+      <w:numFmt w:val="bullet"/>
+      <w:lvlText w:val="●"/>
+      <w:lvlJc w:val="left"/>
+      <w:pPr>
+        <w:ind w:left="2880" w:hanging="360"/>
+      </w:pPr>
+      <w:rPr>
+        <w:u w:val="none"/>
+      </w:rPr>
+    </w:lvl>
+    <w:lvl w:ilvl="4">
+      <w:start w:val="1"/>
+      <w:numFmt w:val="bullet"/>
+      <w:lvlText w:val="○"/>
+      <w:lvlJc w:val="left"/>
+      <w:pPr>
+        <w:ind w:left="3600" w:hanging="360"/>
+      </w:pPr>
+      <w:rPr>
+        <w:u w:val="none"/>
+      </w:rPr>
+    </w:lvl>
+    <w:lvl w:ilvl="5">
+      <w:start w:val="1"/>
+      <w:numFmt w:val="bullet"/>
+      <w:lvlText w:val="■"/>
+      <w:lvlJc w:val="left"/>
+      <w:pPr>
+        <w:ind w:left="4320" w:hanging="360"/>
+      </w:pPr>
+      <w:rPr>
+        <w:u w:val="none"/>
+      </w:rPr>
+    </w:lvl>
+    <w:lvl w:ilvl="6">
+      <w:start w:val="1"/>
+      <w:numFmt w:val="bullet"/>
+      <w:lvlText w:val="●"/>
+      <w:lvlJc w:val="left"/>
+      <w:pPr>
+        <w:ind w:left="5040" w:hanging="360"/>
+      </w:pPr>
+      <w:rPr>
+        <w:u w:val="none"/>
+      </w:rPr>
+    </w:lvl>
+    <w:lvl w:ilvl="7">
+      <w:start w:val="1"/>
+      <w:numFmt w:val="bullet"/>
+      <w:lvlText w:val="○"/>
+      <w:lvlJc w:val="left"/>
+      <w:pPr>
+        <w:ind w:left="5760" w:hanging="360"/>
+      </w:pPr>
+      <w:rPr>
+        <w:u w:val="none"/>
+      </w:rPr>
+    </w:lvl>
+    <w:lvl w:ilvl="8">
+      <w:start w:val="1"/>
+      <w:numFmt w:val="bullet"/>
+      <w:lvlText w:val="■"/>
+      <w:lvlJc w:val="left"/>
+      <w:pPr>
+        <w:ind w:left="6480" w:hanging="360"/>
+      </w:pPr>
+      <w:rPr>
+        <w:u w:val="none"/>
+      </w:rPr>
+    </w:lvl>
+  </w:abstractNum>
+  <w:abstractNum w:abstractNumId="22">
+    <w:lvl w:ilvl="0">
+      <w:start w:val="1"/>
+      <w:numFmt w:val="decimal"/>
+      <w:lvlText w:val="%1."/>
       <w:lvlJc w:val="left"/>
       <w:pPr>
         <w:ind w:left="720" w:hanging="360"/>
@@ -21694,231 +21034,7 @@
       </w:rPr>
     </w:lvl>
   </w:abstractNum>
-  <w:abstractNum w:abstractNumId="22">
-    <w:lvl w:ilvl="0">
-      <w:start w:val="1"/>
-      <w:numFmt w:val="bullet"/>
-      <w:lvlText w:val="●"/>
-      <w:lvlJc w:val="left"/>
-      <w:pPr>
-        <w:ind w:left="720" w:hanging="360"/>
-      </w:pPr>
-      <w:rPr>
-        <w:u w:val="none"/>
-      </w:rPr>
-    </w:lvl>
-    <w:lvl w:ilvl="1">
-      <w:start w:val="1"/>
-      <w:numFmt w:val="bullet"/>
-      <w:lvlText w:val="○"/>
-      <w:lvlJc w:val="left"/>
-      <w:pPr>
-        <w:ind w:left="1440" w:hanging="360"/>
-      </w:pPr>
-      <w:rPr>
-        <w:u w:val="none"/>
-      </w:rPr>
-    </w:lvl>
-    <w:lvl w:ilvl="2">
-      <w:start w:val="1"/>
-      <w:numFmt w:val="bullet"/>
-      <w:lvlText w:val="■"/>
-      <w:lvlJc w:val="left"/>
-      <w:pPr>
-        <w:ind w:left="2160" w:hanging="360"/>
-      </w:pPr>
-      <w:rPr>
-        <w:u w:val="none"/>
-      </w:rPr>
-    </w:lvl>
-    <w:lvl w:ilvl="3">
-      <w:start w:val="1"/>
-      <w:numFmt w:val="bullet"/>
-      <w:lvlText w:val="●"/>
-      <w:lvlJc w:val="left"/>
-      <w:pPr>
-        <w:ind w:left="2880" w:hanging="360"/>
-      </w:pPr>
-      <w:rPr>
-        <w:u w:val="none"/>
-      </w:rPr>
-    </w:lvl>
-    <w:lvl w:ilvl="4">
-      <w:start w:val="1"/>
-      <w:numFmt w:val="bullet"/>
-      <w:lvlText w:val="○"/>
-      <w:lvlJc w:val="left"/>
-      <w:pPr>
-        <w:ind w:left="3600" w:hanging="360"/>
-      </w:pPr>
-      <w:rPr>
-        <w:u w:val="none"/>
-      </w:rPr>
-    </w:lvl>
-    <w:lvl w:ilvl="5">
-      <w:start w:val="1"/>
-      <w:numFmt w:val="bullet"/>
-      <w:lvlText w:val="■"/>
-      <w:lvlJc w:val="left"/>
-      <w:pPr>
-        <w:ind w:left="4320" w:hanging="360"/>
-      </w:pPr>
-      <w:rPr>
-        <w:u w:val="none"/>
-      </w:rPr>
-    </w:lvl>
-    <w:lvl w:ilvl="6">
-      <w:start w:val="1"/>
-      <w:numFmt w:val="bullet"/>
-      <w:lvlText w:val="●"/>
-      <w:lvlJc w:val="left"/>
-      <w:pPr>
-        <w:ind w:left="5040" w:hanging="360"/>
-      </w:pPr>
-      <w:rPr>
-        <w:u w:val="none"/>
-      </w:rPr>
-    </w:lvl>
-    <w:lvl w:ilvl="7">
-      <w:start w:val="1"/>
-      <w:numFmt w:val="bullet"/>
-      <w:lvlText w:val="○"/>
-      <w:lvlJc w:val="left"/>
-      <w:pPr>
-        <w:ind w:left="5760" w:hanging="360"/>
-      </w:pPr>
-      <w:rPr>
-        <w:u w:val="none"/>
-      </w:rPr>
-    </w:lvl>
-    <w:lvl w:ilvl="8">
-      <w:start w:val="1"/>
-      <w:numFmt w:val="bullet"/>
-      <w:lvlText w:val="■"/>
-      <w:lvlJc w:val="left"/>
-      <w:pPr>
-        <w:ind w:left="6480" w:hanging="360"/>
-      </w:pPr>
-      <w:rPr>
-        <w:u w:val="none"/>
-      </w:rPr>
-    </w:lvl>
-  </w:abstractNum>
   <w:abstractNum w:abstractNumId="23">
-    <w:lvl w:ilvl="0">
-      <w:start w:val="1"/>
-      <w:numFmt w:val="decimal"/>
-      <w:lvlText w:val="%1."/>
-      <w:lvlJc w:val="left"/>
-      <w:pPr>
-        <w:ind w:left="720" w:hanging="360"/>
-      </w:pPr>
-      <w:rPr>
-        <w:rFonts w:ascii="Arial" w:cs="Arial" w:eastAsia="Arial" w:hAnsi="Arial"/>
-        <w:color w:val="111111"/>
-        <w:sz w:val="24"/>
-        <w:szCs w:val="24"/>
-        <w:u w:val="none"/>
-      </w:rPr>
-    </w:lvl>
-    <w:lvl w:ilvl="1">
-      <w:start w:val="1"/>
-      <w:numFmt w:val="lowerLetter"/>
-      <w:lvlText w:val="%2."/>
-      <w:lvlJc w:val="left"/>
-      <w:pPr>
-        <w:ind w:left="1440" w:hanging="360"/>
-      </w:pPr>
-      <w:rPr>
-        <w:u w:val="none"/>
-      </w:rPr>
-    </w:lvl>
-    <w:lvl w:ilvl="2">
-      <w:start w:val="1"/>
-      <w:numFmt w:val="lowerRoman"/>
-      <w:lvlText w:val="%3."/>
-      <w:lvlJc w:val="left"/>
-      <w:pPr>
-        <w:ind w:left="2160" w:hanging="360"/>
-      </w:pPr>
-      <w:rPr>
-        <w:u w:val="none"/>
-      </w:rPr>
-    </w:lvl>
-    <w:lvl w:ilvl="3">
-      <w:start w:val="1"/>
-      <w:numFmt w:val="decimal"/>
-      <w:lvlText w:val="%4."/>
-      <w:lvlJc w:val="left"/>
-      <w:pPr>
-        <w:ind w:left="2880" w:hanging="360"/>
-      </w:pPr>
-      <w:rPr>
-        <w:u w:val="none"/>
-      </w:rPr>
-    </w:lvl>
-    <w:lvl w:ilvl="4">
-      <w:start w:val="1"/>
-      <w:numFmt w:val="lowerLetter"/>
-      <w:lvlText w:val="%5."/>
-      <w:lvlJc w:val="left"/>
-      <w:pPr>
-        <w:ind w:left="3600" w:hanging="360"/>
-      </w:pPr>
-      <w:rPr>
-        <w:u w:val="none"/>
-      </w:rPr>
-    </w:lvl>
-    <w:lvl w:ilvl="5">
-      <w:start w:val="1"/>
-      <w:numFmt w:val="lowerRoman"/>
-      <w:lvlText w:val="%6."/>
-      <w:lvlJc w:val="left"/>
-      <w:pPr>
-        <w:ind w:left="4320" w:hanging="360"/>
-      </w:pPr>
-      <w:rPr>
-        <w:u w:val="none"/>
-      </w:rPr>
-    </w:lvl>
-    <w:lvl w:ilvl="6">
-      <w:start w:val="1"/>
-      <w:numFmt w:val="decimal"/>
-      <w:lvlText w:val="%7."/>
-      <w:lvlJc w:val="left"/>
-      <w:pPr>
-        <w:ind w:left="5040" w:hanging="360"/>
-      </w:pPr>
-      <w:rPr>
-        <w:u w:val="none"/>
-      </w:rPr>
-    </w:lvl>
-    <w:lvl w:ilvl="7">
-      <w:start w:val="1"/>
-      <w:numFmt w:val="lowerLetter"/>
-      <w:lvlText w:val="%8."/>
-      <w:lvlJc w:val="left"/>
-      <w:pPr>
-        <w:ind w:left="5760" w:hanging="360"/>
-      </w:pPr>
-      <w:rPr>
-        <w:u w:val="none"/>
-      </w:rPr>
-    </w:lvl>
-    <w:lvl w:ilvl="8">
-      <w:start w:val="1"/>
-      <w:numFmt w:val="lowerRoman"/>
-      <w:lvlText w:val="%9."/>
-      <w:lvlJc w:val="left"/>
-      <w:pPr>
-        <w:ind w:left="6480" w:hanging="360"/>
-      </w:pPr>
-      <w:rPr>
-        <w:u w:val="none"/>
-      </w:rPr>
-    </w:lvl>
-  </w:abstractNum>
-  <w:abstractNum w:abstractNumId="24">
     <w:lvl w:ilvl="0">
       <w:start w:val="1"/>
       <w:numFmt w:val="decimal"/>
@@ -22100,9 +21216,6 @@
   </w:num>
   <w:num w:numId="23">
     <w:abstractNumId w:val="23"/>
-  </w:num>
-  <w:num w:numId="24">
-    <w:abstractNumId w:val="24"/>
   </w:num>
 </w:numbering>
 </file>
@@ -22368,14 +21481,6 @@
     </w:tblPr>
   </w:style>
   <w:style w:type="table" w:styleId="Table12">
-    <w:basedOn w:val="TableNormal"/>
-    <w:tblPr>
-      <w:tblStyleRowBandSize w:val="1"/>
-      <w:tblStyleColBandSize w:val="1"/>
-      <w:tblCellMar/>
-    </w:tblPr>
-  </w:style>
-  <w:style w:type="table" w:styleId="Table13">
     <w:basedOn w:val="TableNormal"/>
     <w:tblPr>
       <w:tblStyleRowBandSize w:val="1"/>

</xml_diff>